<commit_message>
v2 resume download test
</commit_message>
<xml_diff>
--- a/public/Resume-Tristan-Vegas-v2.docx
+++ b/public/Resume-Tristan-Vegas-v2.docx
@@ -49,7 +49,7 @@
           <w:rFonts w:ascii="Segoe UI" w:hAnsi="Segoe UI" w:cs="Segoe UI"/>
           <w:lang w:val="en"/>
         </w:rPr>
-        <w:t>Pamukid, San Fernando, Camarines Sur, Philippines  ·  +63 921 208 9062  ·  vegastristan1@gmail.com</w:t>
+        <w:t>Pamukid, San Fernando, Camarines Sur, Philippines  ·  +63 934 765 1692  ·  vegastristan1@gmail.com</w:t>
       </w:r>
       <w:r>
         <w:rPr>
@@ -57,14 +57,14 @@
           <w:lang w:val="en"/>
         </w:rPr>
         <w:br/>
-        <w:t xml:space="preserve">github.com/vegastr1st1  ·  linkedin.com/in/tristan-vegas  ·  </w:t>
-      </w:r>
-      <w:r>
-        <w:rPr>
-          <w:rFonts w:ascii="Segoe UI" w:hAnsi="Segoe UI" w:cs="Segoe UI"/>
-          <w:lang w:val="en"/>
-        </w:rPr>
-        <w:t xml:space="preserve">tristan-portfolio-ecru.vercel.app </w:t>
+        <w:t xml:space="preserve">github.com/vegastristan1  ·  </w:t>
+      </w:r>
+      <w:r>
+        <w:rPr>
+          <w:rFonts w:ascii="Segoe UI" w:hAnsi="Segoe UI" w:cs="Segoe UI"/>
+          <w:lang w:val="en"/>
+        </w:rPr>
+        <w:t xml:space="preserve">linkedin.com/in/tristan-vegas  ·  tristan-portfolio-v1.vercel.app </w:t>
       </w:r>
     </w:p>
     <w:p>
@@ -86,7 +86,7 @@
           <w:szCs w:val="21"/>
           <w:lang w:val="en"/>
         </w:rPr>
-        <w:pict w14:anchorId="4F27AE15">
+        <w:pict w14:anchorId="12788E21">
           <v:rect id="_x0000_i1025" style="width:0;height:1.5pt" o:hralign="center" o:hrstd="t" o:hr="t" fillcolor="#a0a0a0" stroked="f"/>
         </w:pict>
       </w:r>
@@ -706,7 +706,7 @@
     </w:p>
     <w:p>
       <w:pPr>
-        <w:divId w:val="1962497197"/>
+        <w:divId w:val="1552570649"/>
         <w:rPr>
           <w:rFonts w:ascii="Segoe UI" w:eastAsia="Times New Roman" w:hAnsi="Segoe UI" w:cs="Segoe UI"/>
           <w:color w:val="18181B"/>
@@ -740,7 +740,7 @@
     </w:p>
     <w:p>
       <w:pPr>
-        <w:divId w:val="287661857"/>
+        <w:divId w:val="916941276"/>
         <w:rPr>
           <w:rFonts w:ascii="Segoe UI" w:eastAsia="Times New Roman" w:hAnsi="Segoe UI" w:cs="Segoe UI"/>
           <w:color w:val="18181B"/>
@@ -774,7 +774,7 @@
     </w:p>
     <w:p>
       <w:pPr>
-        <w:divId w:val="319039863"/>
+        <w:divId w:val="891385702"/>
         <w:rPr>
           <w:rFonts w:ascii="Segoe UI" w:eastAsia="Times New Roman" w:hAnsi="Segoe UI" w:cs="Segoe UI"/>
           <w:color w:val="18181B"/>
@@ -808,7 +808,7 @@
     </w:p>
     <w:p>
       <w:pPr>
-        <w:divId w:val="1125928536"/>
+        <w:divId w:val="1021660593"/>
         <w:rPr>
           <w:rFonts w:ascii="Segoe UI" w:eastAsia="Times New Roman" w:hAnsi="Segoe UI" w:cs="Segoe UI"/>
           <w:color w:val="18181B"/>
@@ -842,7 +842,7 @@
     </w:p>
     <w:p>
       <w:pPr>
-        <w:divId w:val="906577777"/>
+        <w:divId w:val="736710692"/>
         <w:rPr>
           <w:rFonts w:ascii="Segoe UI" w:eastAsia="Times New Roman" w:hAnsi="Segoe UI" w:cs="Segoe UI"/>
           <w:color w:val="18181B"/>
@@ -876,7 +876,7 @@
     </w:p>
     <w:p>
       <w:pPr>
-        <w:divId w:val="1181972506"/>
+        <w:divId w:val="67458087"/>
         <w:rPr>
           <w:rFonts w:ascii="Segoe UI" w:eastAsia="Times New Roman" w:hAnsi="Segoe UI" w:cs="Segoe UI"/>
           <w:color w:val="18181B"/>
@@ -910,7 +910,7 @@
     </w:p>
     <w:p>
       <w:pPr>
-        <w:divId w:val="742026242"/>
+        <w:divId w:val="2055154833"/>
         <w:rPr>
           <w:rFonts w:ascii="Segoe UI" w:eastAsia="Times New Roman" w:hAnsi="Segoe UI" w:cs="Segoe UI"/>
           <w:color w:val="18181B"/>
@@ -944,7 +944,7 @@
     </w:p>
     <w:p>
       <w:pPr>
-        <w:divId w:val="1080444147"/>
+        <w:divId w:val="1297879598"/>
         <w:rPr>
           <w:rFonts w:ascii="Segoe UI" w:eastAsia="Times New Roman" w:hAnsi="Segoe UI" w:cs="Segoe UI"/>
           <w:color w:val="18181B"/>
@@ -1116,7 +1116,7 @@
     <w:p>
       <w:pPr>
         <w:pStyle w:val="Heading3"/>
-        <w:divId w:val="731736523"/>
+        <w:divId w:val="1927877286"/>
         <w:rPr>
           <w:rFonts w:ascii="Segoe UI" w:eastAsia="Times New Roman" w:hAnsi="Segoe UI" w:cs="Segoe UI"/>
           <w:color w:val="18181B"/>
@@ -1135,7 +1135,7 @@
     <w:p>
       <w:pPr>
         <w:pStyle w:val="NormalWeb"/>
-        <w:divId w:val="731736523"/>
+        <w:divId w:val="1927877286"/>
         <w:rPr>
           <w:rFonts w:ascii="Segoe UI" w:hAnsi="Segoe UI" w:cs="Segoe UI"/>
           <w:color w:val="18181B"/>
@@ -1158,7 +1158,7 @@
     <w:p>
       <w:pPr>
         <w:pStyle w:val="tools1"/>
-        <w:divId w:val="731736523"/>
+        <w:divId w:val="1927877286"/>
         <w:rPr>
           <w:rFonts w:ascii="Segoe UI" w:hAnsi="Segoe UI" w:cs="Segoe UI"/>
           <w:lang w:val="en"/>
@@ -1175,7 +1175,7 @@
     <w:p>
       <w:pPr>
         <w:pStyle w:val="Heading3"/>
-        <w:divId w:val="976688609"/>
+        <w:divId w:val="1827282188"/>
         <w:rPr>
           <w:rFonts w:ascii="Segoe UI" w:eastAsia="Times New Roman" w:hAnsi="Segoe UI" w:cs="Segoe UI"/>
           <w:color w:val="18181B"/>
@@ -1194,7 +1194,7 @@
     <w:p>
       <w:pPr>
         <w:pStyle w:val="NormalWeb"/>
-        <w:divId w:val="976688609"/>
+        <w:divId w:val="1827282188"/>
         <w:rPr>
           <w:rFonts w:ascii="Segoe UI" w:hAnsi="Segoe UI" w:cs="Segoe UI"/>
           <w:color w:val="18181B"/>
@@ -1218,7 +1218,7 @@
     <w:p>
       <w:pPr>
         <w:pStyle w:val="tools1"/>
-        <w:divId w:val="976688609"/>
+        <w:divId w:val="1827282188"/>
         <w:rPr>
           <w:rFonts w:ascii="Segoe UI" w:hAnsi="Segoe UI" w:cs="Segoe UI"/>
           <w:lang w:val="en"/>
@@ -1235,7 +1235,7 @@
     <w:p>
       <w:pPr>
         <w:pStyle w:val="Heading3"/>
-        <w:divId w:val="1563760124"/>
+        <w:divId w:val="1745299639"/>
         <w:rPr>
           <w:rFonts w:ascii="Segoe UI" w:eastAsia="Times New Roman" w:hAnsi="Segoe UI" w:cs="Segoe UI"/>
           <w:color w:val="18181B"/>
@@ -1254,7 +1254,7 @@
     <w:p>
       <w:pPr>
         <w:pStyle w:val="NormalWeb"/>
-        <w:divId w:val="1563760124"/>
+        <w:divId w:val="1745299639"/>
         <w:rPr>
           <w:rFonts w:ascii="Segoe UI" w:hAnsi="Segoe UI" w:cs="Segoe UI"/>
           <w:color w:val="18181B"/>
@@ -1277,7 +1277,7 @@
     <w:p>
       <w:pPr>
         <w:pStyle w:val="tools1"/>
-        <w:divId w:val="1563760124"/>
+        <w:divId w:val="1745299639"/>
         <w:rPr>
           <w:rFonts w:ascii="Segoe UI" w:hAnsi="Segoe UI" w:cs="Segoe UI"/>
           <w:lang w:val="en"/>
@@ -1294,7 +1294,7 @@
     <w:p>
       <w:pPr>
         <w:pStyle w:val="Heading3"/>
-        <w:divId w:val="2016373465"/>
+        <w:divId w:val="2104835903"/>
         <w:rPr>
           <w:rFonts w:ascii="Segoe UI" w:eastAsia="Times New Roman" w:hAnsi="Segoe UI" w:cs="Segoe UI"/>
           <w:color w:val="18181B"/>
@@ -1313,7 +1313,7 @@
     <w:p>
       <w:pPr>
         <w:pStyle w:val="NormalWeb"/>
-        <w:divId w:val="2016373465"/>
+        <w:divId w:val="2104835903"/>
         <w:rPr>
           <w:rFonts w:ascii="Segoe UI" w:hAnsi="Segoe UI" w:cs="Segoe UI"/>
           <w:color w:val="18181B"/>
@@ -1336,7 +1336,7 @@
     <w:p>
       <w:pPr>
         <w:pStyle w:val="tools1"/>
-        <w:divId w:val="2016373465"/>
+        <w:divId w:val="2104835903"/>
         <w:rPr>
           <w:rFonts w:ascii="Segoe UI" w:hAnsi="Segoe UI" w:cs="Segoe UI"/>
           <w:lang w:val="en"/>
@@ -1353,7 +1353,7 @@
     <w:p>
       <w:pPr>
         <w:pStyle w:val="Heading3"/>
-        <w:divId w:val="835418437"/>
+        <w:divId w:val="1708337728"/>
         <w:rPr>
           <w:rFonts w:ascii="Segoe UI" w:eastAsia="Times New Roman" w:hAnsi="Segoe UI" w:cs="Segoe UI"/>
           <w:color w:val="18181B"/>
@@ -1372,7 +1372,7 @@
     <w:p>
       <w:pPr>
         <w:pStyle w:val="NormalWeb"/>
-        <w:divId w:val="835418437"/>
+        <w:divId w:val="1708337728"/>
         <w:rPr>
           <w:rFonts w:ascii="Segoe UI" w:hAnsi="Segoe UI" w:cs="Segoe UI"/>
           <w:color w:val="18181B"/>
@@ -1395,7 +1395,7 @@
     <w:p>
       <w:pPr>
         <w:pStyle w:val="tools1"/>
-        <w:divId w:val="835418437"/>
+        <w:divId w:val="1708337728"/>
         <w:rPr>
           <w:rFonts w:ascii="Segoe UI" w:hAnsi="Segoe UI" w:cs="Segoe UI"/>
           <w:lang w:val="en"/>
@@ -1412,7 +1412,7 @@
     <w:p>
       <w:pPr>
         <w:pStyle w:val="Heading3"/>
-        <w:divId w:val="2018459177"/>
+        <w:divId w:val="1629973985"/>
         <w:rPr>
           <w:rFonts w:ascii="Segoe UI" w:eastAsia="Times New Roman" w:hAnsi="Segoe UI" w:cs="Segoe UI"/>
           <w:color w:val="18181B"/>
@@ -1431,7 +1431,7 @@
     <w:p>
       <w:pPr>
         <w:pStyle w:val="NormalWeb"/>
-        <w:divId w:val="2018459177"/>
+        <w:divId w:val="1629973985"/>
         <w:rPr>
           <w:rFonts w:ascii="Segoe UI" w:hAnsi="Segoe UI" w:cs="Segoe UI"/>
           <w:color w:val="18181B"/>
@@ -1454,7 +1454,7 @@
     <w:p>
       <w:pPr>
         <w:pStyle w:val="tools1"/>
-        <w:divId w:val="2018459177"/>
+        <w:divId w:val="1629973985"/>
         <w:rPr>
           <w:rFonts w:ascii="Segoe UI" w:hAnsi="Segoe UI" w:cs="Segoe UI"/>
           <w:lang w:val="en"/>
@@ -1471,7 +1471,7 @@
     <w:p>
       <w:pPr>
         <w:pStyle w:val="Heading3"/>
-        <w:divId w:val="1028720388"/>
+        <w:divId w:val="2077165093"/>
         <w:rPr>
           <w:rFonts w:ascii="Segoe UI" w:eastAsia="Times New Roman" w:hAnsi="Segoe UI" w:cs="Segoe UI"/>
           <w:color w:val="18181B"/>
@@ -1490,7 +1490,7 @@
     <w:p>
       <w:pPr>
         <w:pStyle w:val="NormalWeb"/>
-        <w:divId w:val="1028720388"/>
+        <w:divId w:val="2077165093"/>
         <w:rPr>
           <w:rFonts w:ascii="Segoe UI" w:hAnsi="Segoe UI" w:cs="Segoe UI"/>
           <w:color w:val="18181B"/>
@@ -1513,7 +1513,7 @@
     <w:p>
       <w:pPr>
         <w:pStyle w:val="tools1"/>
-        <w:divId w:val="1028720388"/>
+        <w:divId w:val="2077165093"/>
         <w:rPr>
           <w:rFonts w:ascii="Segoe UI" w:hAnsi="Segoe UI" w:cs="Segoe UI"/>
           <w:lang w:val="en"/>
@@ -1638,9 +1638,9 @@
 <file path=word/numbering.xml><?xml version="1.0" encoding="utf-8"?>
 <w:numbering xmlns:wpc="http://schemas.microsoft.com/office/word/2010/wordprocessingCanvas" xmlns:cx="http://schemas.microsoft.com/office/drawing/2014/chartex" xmlns:cx1="http://schemas.microsoft.com/office/drawing/2015/9/8/chartex" xmlns:cx2="http://schemas.microsoft.com/office/drawing/2015/10/21/chartex" xmlns:cx3="http://schemas.microsoft.com/office/drawing/2016/5/9/chartex" xmlns:cx4="http://schemas.microsoft.com/office/drawing/2016/5/10/chartex" xmlns:cx5="http://schemas.microsoft.com/office/drawing/2016/5/11/chartex" xmlns:cx6="http://schemas.microsoft.com/office/drawing/2016/5/12/chartex" xmlns:cx7="http://schemas.microsoft.com/office/drawing/2016/5/13/chartex" xmlns:cx8="http://schemas.microsoft.com/office/drawing/2016/5/14/chartex" xmlns:mc="http://schemas.openxmlformats.org/markup-compatibility/2006" xmlns:aink="http://schemas.microsoft.com/office/drawing/2016/ink" xmlns:am3d="http://schemas.microsoft.com/office/drawing/2017/model3d" xmlns:o="urn:schemas-microsoft-com:office:office" xmlns:oel="http://schemas.microsoft.com/office/2019/extlst" xmlns:r="http://schemas.openxmlformats.org/officeDocument/2006/relationships" xmlns:m="http://schemas.openxmlformats.org/officeDocument/2006/math" xmlns:v="urn:schemas-microsoft-com:vml" xmlns:wp14="http://schemas.microsoft.com/office/word/2010/wordprocessingDrawing" xmlns:wp="http://schemas.openxmlformats.org/drawingml/2006/wordprocessingDrawing" xmlns:w10="urn:schemas-microsoft-com:office:word" xmlns:w="http://schemas.openxmlformats.org/wordprocessingml/2006/main" xmlns:w14="http://schemas.microsoft.com/office/word/2010/wordml" xmlns:w15="http://schemas.microsoft.com/office/word/2012/wordml" xmlns:w16cex="http://schemas.microsoft.com/office/word/2018/wordml/cex" xmlns:w16cid="http://schemas.microsoft.com/office/word/2016/wordml/cid" xmlns:w16="http://schemas.microsoft.com/office/word/2018/wordml" xmlns:w16du="http://schemas.microsoft.com/office/word/2023/wordml/word16du" xmlns:w16sdtdh="http://schemas.microsoft.com/office/word/2020/wordml/sdtdatahash" xmlns:w16sdtfl="http://schemas.microsoft.com/office/word/2024/wordml/sdtformatlock" xmlns:w16se="http://schemas.microsoft.com/office/word/2015/wordml/symex" xmlns:wpg="http://schemas.microsoft.com/office/word/2010/wordprocessingGroup" xmlns:wpi="http://schemas.microsoft.com/office/word/2010/wordprocessingInk" xmlns:wne="http://schemas.microsoft.com/office/word/2006/wordml" xmlns:wps="http://schemas.microsoft.com/office/word/2010/wordprocessingShape" mc:Ignorable="w14 w15 w16se w16cid w16 w16cex w16sdtdh w16sdtfl w16du wp14">
   <w:abstractNum w:abstractNumId="0" w15:restartNumberingAfterBreak="0">
-    <w:nsid w:val="0AAC22E7"/>
+    <w:nsid w:val="10AC512D"/>
     <w:multiLevelType w:val="multilevel"/>
-    <w:tmpl w:val="3E967530"/>
+    <w:tmpl w:val="FE3033CA"/>
     <w:lvl w:ilvl="0">
       <w:start w:val="1"/>
       <w:numFmt w:val="bullet"/>
@@ -1787,9 +1787,9 @@
     </w:lvl>
   </w:abstractNum>
   <w:abstractNum w:abstractNumId="1" w15:restartNumberingAfterBreak="0">
-    <w:nsid w:val="2A7A3EBD"/>
+    <w:nsid w:val="2BFD5395"/>
     <w:multiLevelType w:val="multilevel"/>
-    <w:tmpl w:val="3ABC912C"/>
+    <w:tmpl w:val="8F6EE088"/>
     <w:lvl w:ilvl="0">
       <w:start w:val="1"/>
       <w:numFmt w:val="bullet"/>
@@ -1936,9 +1936,9 @@
     </w:lvl>
   </w:abstractNum>
   <w:abstractNum w:abstractNumId="2" w15:restartNumberingAfterBreak="0">
-    <w:nsid w:val="49D66C8C"/>
+    <w:nsid w:val="50690C0F"/>
     <w:multiLevelType w:val="multilevel"/>
-    <w:tmpl w:val="F052F87C"/>
+    <w:tmpl w:val="87E61206"/>
     <w:lvl w:ilvl="0">
       <w:start w:val="1"/>
       <w:numFmt w:val="bullet"/>
@@ -2085,9 +2085,9 @@
     </w:lvl>
   </w:abstractNum>
   <w:abstractNum w:abstractNumId="3" w15:restartNumberingAfterBreak="0">
-    <w:nsid w:val="6B574911"/>
+    <w:nsid w:val="780B15F3"/>
     <w:multiLevelType w:val="multilevel"/>
-    <w:tmpl w:val="931615D8"/>
+    <w:tmpl w:val="727C5CFA"/>
     <w:lvl w:ilvl="0">
       <w:start w:val="1"/>
       <w:numFmt w:val="bullet"/>
@@ -2233,17 +2233,17 @@
       </w:rPr>
     </w:lvl>
   </w:abstractNum>
-  <w:num w:numId="1" w16cid:durableId="327369130">
+  <w:num w:numId="1" w16cid:durableId="928395063">
+    <w:abstractNumId w:val="1"/>
+  </w:num>
+  <w:num w:numId="2" w16cid:durableId="260142300">
     <w:abstractNumId w:val="0"/>
   </w:num>
-  <w:num w:numId="2" w16cid:durableId="664476801">
+  <w:num w:numId="3" w16cid:durableId="657928326">
+    <w:abstractNumId w:val="3"/>
+  </w:num>
+  <w:num w:numId="4" w16cid:durableId="1717002548">
     <w:abstractNumId w:val="2"/>
-  </w:num>
-  <w:num w:numId="3" w16cid:durableId="1564369458">
-    <w:abstractNumId w:val="1"/>
-  </w:num>
-  <w:num w:numId="4" w16cid:durableId="1100178811">
-    <w:abstractNumId w:val="3"/>
   </w:num>
 </w:numbering>
 </file>

</xml_diff>

<commit_message>
Remove references line from v2 resume
</commit_message>
<xml_diff>
--- a/public/Resume-Tristan-Vegas-v2.docx
+++ b/public/Resume-Tristan-Vegas-v2.docx
@@ -86,7 +86,7 @@
           <w:szCs w:val="21"/>
           <w:lang w:val="en"/>
         </w:rPr>
-        <w:pict w14:anchorId="12788E21">
+        <w:pict w14:anchorId="378F79EF">
           <v:rect id="_x0000_i1025" style="width:0;height:1.5pt" o:hralign="center" o:hrstd="t" o:hr="t" fillcolor="#a0a0a0" stroked="f"/>
         </w:pict>
       </w:r>
@@ -706,7 +706,7 @@
     </w:p>
     <w:p>
       <w:pPr>
-        <w:divId w:val="1552570649"/>
+        <w:divId w:val="195317102"/>
         <w:rPr>
           <w:rFonts w:ascii="Segoe UI" w:eastAsia="Times New Roman" w:hAnsi="Segoe UI" w:cs="Segoe UI"/>
           <w:color w:val="18181B"/>
@@ -740,7 +740,7 @@
     </w:p>
     <w:p>
       <w:pPr>
-        <w:divId w:val="916941276"/>
+        <w:divId w:val="487747928"/>
         <w:rPr>
           <w:rFonts w:ascii="Segoe UI" w:eastAsia="Times New Roman" w:hAnsi="Segoe UI" w:cs="Segoe UI"/>
           <w:color w:val="18181B"/>
@@ -774,7 +774,7 @@
     </w:p>
     <w:p>
       <w:pPr>
-        <w:divId w:val="891385702"/>
+        <w:divId w:val="1497184581"/>
         <w:rPr>
           <w:rFonts w:ascii="Segoe UI" w:eastAsia="Times New Roman" w:hAnsi="Segoe UI" w:cs="Segoe UI"/>
           <w:color w:val="18181B"/>
@@ -808,7 +808,7 @@
     </w:p>
     <w:p>
       <w:pPr>
-        <w:divId w:val="1021660593"/>
+        <w:divId w:val="534005371"/>
         <w:rPr>
           <w:rFonts w:ascii="Segoe UI" w:eastAsia="Times New Roman" w:hAnsi="Segoe UI" w:cs="Segoe UI"/>
           <w:color w:val="18181B"/>
@@ -842,7 +842,7 @@
     </w:p>
     <w:p>
       <w:pPr>
-        <w:divId w:val="736710692"/>
+        <w:divId w:val="1913389357"/>
         <w:rPr>
           <w:rFonts w:ascii="Segoe UI" w:eastAsia="Times New Roman" w:hAnsi="Segoe UI" w:cs="Segoe UI"/>
           <w:color w:val="18181B"/>
@@ -876,7 +876,7 @@
     </w:p>
     <w:p>
       <w:pPr>
-        <w:divId w:val="67458087"/>
+        <w:divId w:val="518786244"/>
         <w:rPr>
           <w:rFonts w:ascii="Segoe UI" w:eastAsia="Times New Roman" w:hAnsi="Segoe UI" w:cs="Segoe UI"/>
           <w:color w:val="18181B"/>
@@ -910,7 +910,7 @@
     </w:p>
     <w:p>
       <w:pPr>
-        <w:divId w:val="2055154833"/>
+        <w:divId w:val="981159729"/>
         <w:rPr>
           <w:rFonts w:ascii="Segoe UI" w:eastAsia="Times New Roman" w:hAnsi="Segoe UI" w:cs="Segoe UI"/>
           <w:color w:val="18181B"/>
@@ -944,7 +944,7 @@
     </w:p>
     <w:p>
       <w:pPr>
-        <w:divId w:val="1297879598"/>
+        <w:divId w:val="433595335"/>
         <w:rPr>
           <w:rFonts w:ascii="Segoe UI" w:eastAsia="Times New Roman" w:hAnsi="Segoe UI" w:cs="Segoe UI"/>
           <w:color w:val="18181B"/>
@@ -1116,7 +1116,7 @@
     <w:p>
       <w:pPr>
         <w:pStyle w:val="Heading3"/>
-        <w:divId w:val="1927877286"/>
+        <w:divId w:val="443114441"/>
         <w:rPr>
           <w:rFonts w:ascii="Segoe UI" w:eastAsia="Times New Roman" w:hAnsi="Segoe UI" w:cs="Segoe UI"/>
           <w:color w:val="18181B"/>
@@ -1135,7 +1135,7 @@
     <w:p>
       <w:pPr>
         <w:pStyle w:val="NormalWeb"/>
-        <w:divId w:val="1927877286"/>
+        <w:divId w:val="443114441"/>
         <w:rPr>
           <w:rFonts w:ascii="Segoe UI" w:hAnsi="Segoe UI" w:cs="Segoe UI"/>
           <w:color w:val="18181B"/>
@@ -1158,7 +1158,7 @@
     <w:p>
       <w:pPr>
         <w:pStyle w:val="tools1"/>
-        <w:divId w:val="1927877286"/>
+        <w:divId w:val="443114441"/>
         <w:rPr>
           <w:rFonts w:ascii="Segoe UI" w:hAnsi="Segoe UI" w:cs="Segoe UI"/>
           <w:lang w:val="en"/>
@@ -1175,7 +1175,7 @@
     <w:p>
       <w:pPr>
         <w:pStyle w:val="Heading3"/>
-        <w:divId w:val="1827282188"/>
+        <w:divId w:val="1304383272"/>
         <w:rPr>
           <w:rFonts w:ascii="Segoe UI" w:eastAsia="Times New Roman" w:hAnsi="Segoe UI" w:cs="Segoe UI"/>
           <w:color w:val="18181B"/>
@@ -1194,7 +1194,7 @@
     <w:p>
       <w:pPr>
         <w:pStyle w:val="NormalWeb"/>
-        <w:divId w:val="1827282188"/>
+        <w:divId w:val="1304383272"/>
         <w:rPr>
           <w:rFonts w:ascii="Segoe UI" w:hAnsi="Segoe UI" w:cs="Segoe UI"/>
           <w:color w:val="18181B"/>
@@ -1218,7 +1218,8 @@
     <w:p>
       <w:pPr>
         <w:pStyle w:val="tools1"/>
-        <w:divId w:val="1827282188"/>
+        <w:spacing w:after="160"/>
+        <w:divId w:val="1304383272"/>
         <w:rPr>
           <w:rFonts w:ascii="Segoe UI" w:hAnsi="Segoe UI" w:cs="Segoe UI"/>
           <w:lang w:val="en"/>
@@ -1235,7 +1236,7 @@
     <w:p>
       <w:pPr>
         <w:pStyle w:val="Heading3"/>
-        <w:divId w:val="1745299639"/>
+        <w:divId w:val="1097604861"/>
         <w:rPr>
           <w:rFonts w:ascii="Segoe UI" w:eastAsia="Times New Roman" w:hAnsi="Segoe UI" w:cs="Segoe UI"/>
           <w:color w:val="18181B"/>
@@ -1254,7 +1255,7 @@
     <w:p>
       <w:pPr>
         <w:pStyle w:val="NormalWeb"/>
-        <w:divId w:val="1745299639"/>
+        <w:divId w:val="1097604861"/>
         <w:rPr>
           <w:rFonts w:ascii="Segoe UI" w:hAnsi="Segoe UI" w:cs="Segoe UI"/>
           <w:color w:val="18181B"/>
@@ -1277,7 +1278,8 @@
     <w:p>
       <w:pPr>
         <w:pStyle w:val="tools1"/>
-        <w:divId w:val="1745299639"/>
+        <w:spacing w:after="160"/>
+        <w:divId w:val="1097604861"/>
         <w:rPr>
           <w:rFonts w:ascii="Segoe UI" w:hAnsi="Segoe UI" w:cs="Segoe UI"/>
           <w:lang w:val="en"/>
@@ -1294,7 +1296,7 @@
     <w:p>
       <w:pPr>
         <w:pStyle w:val="Heading3"/>
-        <w:divId w:val="2104835903"/>
+        <w:divId w:val="1730372877"/>
         <w:rPr>
           <w:rFonts w:ascii="Segoe UI" w:eastAsia="Times New Roman" w:hAnsi="Segoe UI" w:cs="Segoe UI"/>
           <w:color w:val="18181B"/>
@@ -1313,7 +1315,7 @@
     <w:p>
       <w:pPr>
         <w:pStyle w:val="NormalWeb"/>
-        <w:divId w:val="2104835903"/>
+        <w:divId w:val="1730372877"/>
         <w:rPr>
           <w:rFonts w:ascii="Segoe UI" w:hAnsi="Segoe UI" w:cs="Segoe UI"/>
           <w:color w:val="18181B"/>
@@ -1336,7 +1338,8 @@
     <w:p>
       <w:pPr>
         <w:pStyle w:val="tools1"/>
-        <w:divId w:val="2104835903"/>
+        <w:spacing w:after="160"/>
+        <w:divId w:val="1730372877"/>
         <w:rPr>
           <w:rFonts w:ascii="Segoe UI" w:hAnsi="Segoe UI" w:cs="Segoe UI"/>
           <w:lang w:val="en"/>
@@ -1353,7 +1356,7 @@
     <w:p>
       <w:pPr>
         <w:pStyle w:val="Heading3"/>
-        <w:divId w:val="1708337728"/>
+        <w:divId w:val="1236358932"/>
         <w:rPr>
           <w:rFonts w:ascii="Segoe UI" w:eastAsia="Times New Roman" w:hAnsi="Segoe UI" w:cs="Segoe UI"/>
           <w:color w:val="18181B"/>
@@ -1372,7 +1375,7 @@
     <w:p>
       <w:pPr>
         <w:pStyle w:val="NormalWeb"/>
-        <w:divId w:val="1708337728"/>
+        <w:divId w:val="1236358932"/>
         <w:rPr>
           <w:rFonts w:ascii="Segoe UI" w:hAnsi="Segoe UI" w:cs="Segoe UI"/>
           <w:color w:val="18181B"/>
@@ -1395,7 +1398,8 @@
     <w:p>
       <w:pPr>
         <w:pStyle w:val="tools1"/>
-        <w:divId w:val="1708337728"/>
+        <w:spacing w:after="160"/>
+        <w:divId w:val="1236358932"/>
         <w:rPr>
           <w:rFonts w:ascii="Segoe UI" w:hAnsi="Segoe UI" w:cs="Segoe UI"/>
           <w:lang w:val="en"/>
@@ -1412,7 +1416,7 @@
     <w:p>
       <w:pPr>
         <w:pStyle w:val="Heading3"/>
-        <w:divId w:val="1629973985"/>
+        <w:divId w:val="1144587514"/>
         <w:rPr>
           <w:rFonts w:ascii="Segoe UI" w:eastAsia="Times New Roman" w:hAnsi="Segoe UI" w:cs="Segoe UI"/>
           <w:color w:val="18181B"/>
@@ -1431,7 +1435,7 @@
     <w:p>
       <w:pPr>
         <w:pStyle w:val="NormalWeb"/>
-        <w:divId w:val="1629973985"/>
+        <w:divId w:val="1144587514"/>
         <w:rPr>
           <w:rFonts w:ascii="Segoe UI" w:hAnsi="Segoe UI" w:cs="Segoe UI"/>
           <w:color w:val="18181B"/>
@@ -1454,7 +1458,8 @@
     <w:p>
       <w:pPr>
         <w:pStyle w:val="tools1"/>
-        <w:divId w:val="1629973985"/>
+        <w:spacing w:after="160"/>
+        <w:divId w:val="1144587514"/>
         <w:rPr>
           <w:rFonts w:ascii="Segoe UI" w:hAnsi="Segoe UI" w:cs="Segoe UI"/>
           <w:lang w:val="en"/>
@@ -1471,7 +1476,7 @@
     <w:p>
       <w:pPr>
         <w:pStyle w:val="Heading3"/>
-        <w:divId w:val="2077165093"/>
+        <w:divId w:val="1695887862"/>
         <w:rPr>
           <w:rFonts w:ascii="Segoe UI" w:eastAsia="Times New Roman" w:hAnsi="Segoe UI" w:cs="Segoe UI"/>
           <w:color w:val="18181B"/>
@@ -1490,7 +1495,7 @@
     <w:p>
       <w:pPr>
         <w:pStyle w:val="NormalWeb"/>
-        <w:divId w:val="2077165093"/>
+        <w:divId w:val="1695887862"/>
         <w:rPr>
           <w:rFonts w:ascii="Segoe UI" w:hAnsi="Segoe UI" w:cs="Segoe UI"/>
           <w:color w:val="18181B"/>
@@ -1513,7 +1518,8 @@
     <w:p>
       <w:pPr>
         <w:pStyle w:val="tools1"/>
-        <w:divId w:val="2077165093"/>
+        <w:spacing w:after="160"/>
+        <w:divId w:val="1695887862"/>
         <w:rPr>
           <w:rFonts w:ascii="Segoe UI" w:hAnsi="Segoe UI" w:cs="Segoe UI"/>
           <w:lang w:val="en"/>
@@ -1612,17 +1618,7 @@
           <w:szCs w:val="21"/>
           <w:lang w:val="en"/>
         </w:rPr>
-        <w:t>English, Filipino  </w:t>
-      </w:r>
-      <w:r>
-        <w:rPr>
-          <w:rStyle w:val="muted1"/>
-          <w:rFonts w:ascii="Segoe UI" w:hAnsi="Segoe UI" w:cs="Segoe UI"/>
-          <w:sz w:val="21"/>
-          <w:szCs w:val="21"/>
-          <w:lang w:val="en"/>
-        </w:rPr>
-        <w:t>· References available upon request.</w:t>
+        <w:t>English, Filipino</w:t>
       </w:r>
     </w:p>
     <w:sectPr>
@@ -1638,9 +1634,9 @@
 <file path=word/numbering.xml><?xml version="1.0" encoding="utf-8"?>
 <w:numbering xmlns:wpc="http://schemas.microsoft.com/office/word/2010/wordprocessingCanvas" xmlns:cx="http://schemas.microsoft.com/office/drawing/2014/chartex" xmlns:cx1="http://schemas.microsoft.com/office/drawing/2015/9/8/chartex" xmlns:cx2="http://schemas.microsoft.com/office/drawing/2015/10/21/chartex" xmlns:cx3="http://schemas.microsoft.com/office/drawing/2016/5/9/chartex" xmlns:cx4="http://schemas.microsoft.com/office/drawing/2016/5/10/chartex" xmlns:cx5="http://schemas.microsoft.com/office/drawing/2016/5/11/chartex" xmlns:cx6="http://schemas.microsoft.com/office/drawing/2016/5/12/chartex" xmlns:cx7="http://schemas.microsoft.com/office/drawing/2016/5/13/chartex" xmlns:cx8="http://schemas.microsoft.com/office/drawing/2016/5/14/chartex" xmlns:mc="http://schemas.openxmlformats.org/markup-compatibility/2006" xmlns:aink="http://schemas.microsoft.com/office/drawing/2016/ink" xmlns:am3d="http://schemas.microsoft.com/office/drawing/2017/model3d" xmlns:o="urn:schemas-microsoft-com:office:office" xmlns:oel="http://schemas.microsoft.com/office/2019/extlst" xmlns:r="http://schemas.openxmlformats.org/officeDocument/2006/relationships" xmlns:m="http://schemas.openxmlformats.org/officeDocument/2006/math" xmlns:v="urn:schemas-microsoft-com:vml" xmlns:wp14="http://schemas.microsoft.com/office/word/2010/wordprocessingDrawing" xmlns:wp="http://schemas.openxmlformats.org/drawingml/2006/wordprocessingDrawing" xmlns:w10="urn:schemas-microsoft-com:office:word" xmlns:w="http://schemas.openxmlformats.org/wordprocessingml/2006/main" xmlns:w14="http://schemas.microsoft.com/office/word/2010/wordml" xmlns:w15="http://schemas.microsoft.com/office/word/2012/wordml" xmlns:w16cex="http://schemas.microsoft.com/office/word/2018/wordml/cex" xmlns:w16cid="http://schemas.microsoft.com/office/word/2016/wordml/cid" xmlns:w16="http://schemas.microsoft.com/office/word/2018/wordml" xmlns:w16du="http://schemas.microsoft.com/office/word/2023/wordml/word16du" xmlns:w16sdtdh="http://schemas.microsoft.com/office/word/2020/wordml/sdtdatahash" xmlns:w16sdtfl="http://schemas.microsoft.com/office/word/2024/wordml/sdtformatlock" xmlns:w16se="http://schemas.microsoft.com/office/word/2015/wordml/symex" xmlns:wpg="http://schemas.microsoft.com/office/word/2010/wordprocessingGroup" xmlns:wpi="http://schemas.microsoft.com/office/word/2010/wordprocessingInk" xmlns:wne="http://schemas.microsoft.com/office/word/2006/wordml" xmlns:wps="http://schemas.microsoft.com/office/word/2010/wordprocessingShape" mc:Ignorable="w14 w15 w16se w16cid w16 w16cex w16sdtdh w16sdtfl w16du wp14">
   <w:abstractNum w:abstractNumId="0" w15:restartNumberingAfterBreak="0">
-    <w:nsid w:val="10AC512D"/>
+    <w:nsid w:val="035746F6"/>
     <w:multiLevelType w:val="multilevel"/>
-    <w:tmpl w:val="FE3033CA"/>
+    <w:tmpl w:val="042C6592"/>
     <w:lvl w:ilvl="0">
       <w:start w:val="1"/>
       <w:numFmt w:val="bullet"/>
@@ -1787,9 +1783,9 @@
     </w:lvl>
   </w:abstractNum>
   <w:abstractNum w:abstractNumId="1" w15:restartNumberingAfterBreak="0">
-    <w:nsid w:val="2BFD5395"/>
+    <w:nsid w:val="27A9345E"/>
     <w:multiLevelType w:val="multilevel"/>
-    <w:tmpl w:val="8F6EE088"/>
+    <w:tmpl w:val="6108E53A"/>
     <w:lvl w:ilvl="0">
       <w:start w:val="1"/>
       <w:numFmt w:val="bullet"/>
@@ -1936,9 +1932,9 @@
     </w:lvl>
   </w:abstractNum>
   <w:abstractNum w:abstractNumId="2" w15:restartNumberingAfterBreak="0">
-    <w:nsid w:val="50690C0F"/>
+    <w:nsid w:val="36C67BCA"/>
     <w:multiLevelType w:val="multilevel"/>
-    <w:tmpl w:val="87E61206"/>
+    <w:tmpl w:val="B1BCF064"/>
     <w:lvl w:ilvl="0">
       <w:start w:val="1"/>
       <w:numFmt w:val="bullet"/>
@@ -2085,9 +2081,9 @@
     </w:lvl>
   </w:abstractNum>
   <w:abstractNum w:abstractNumId="3" w15:restartNumberingAfterBreak="0">
-    <w:nsid w:val="780B15F3"/>
+    <w:nsid w:val="392B6B59"/>
     <w:multiLevelType w:val="multilevel"/>
-    <w:tmpl w:val="727C5CFA"/>
+    <w:tmpl w:val="E828FBCA"/>
     <w:lvl w:ilvl="0">
       <w:start w:val="1"/>
       <w:numFmt w:val="bullet"/>
@@ -2233,17 +2229,17 @@
       </w:rPr>
     </w:lvl>
   </w:abstractNum>
-  <w:num w:numId="1" w16cid:durableId="928395063">
+  <w:num w:numId="1" w16cid:durableId="2058115584">
+    <w:abstractNumId w:val="2"/>
+  </w:num>
+  <w:num w:numId="2" w16cid:durableId="71855869">
+    <w:abstractNumId w:val="0"/>
+  </w:num>
+  <w:num w:numId="3" w16cid:durableId="801505397">
     <w:abstractNumId w:val="1"/>
   </w:num>
-  <w:num w:numId="2" w16cid:durableId="260142300">
-    <w:abstractNumId w:val="0"/>
-  </w:num>
-  <w:num w:numId="3" w16cid:durableId="657928326">
+  <w:num w:numId="4" w16cid:durableId="156263827">
     <w:abstractNumId w:val="3"/>
-  </w:num>
-  <w:num w:numId="4" w16cid:durableId="1717002548">
-    <w:abstractNumId w:val="2"/>
   </w:num>
 </w:numbering>
 </file>
@@ -2916,13 +2912,6 @@
       <w:spacing w:before="100" w:beforeAutospacing="1" w:after="100" w:afterAutospacing="1"/>
     </w:pPr>
   </w:style>
-  <w:style w:type="character" w:customStyle="1" w:styleId="muted1">
-    <w:name w:val="muted1"/>
-    <w:basedOn w:val="DefaultParagraphFont"/>
-    <w:rPr>
-      <w:color w:val="52525B"/>
-    </w:rPr>
-  </w:style>
 </w:styles>
 </file>
 

</xml_diff>

<commit_message>
Update skills, tagline and AI positioning; sync resume PDF/DOCX with new project
</commit_message>
<xml_diff>
--- a/public/Resume-Tristan-Vegas-v2.docx
+++ b/public/Resume-Tristan-Vegas-v2.docx
@@ -33,7 +33,7 @@
           <w:rFonts w:ascii="Segoe UI" w:hAnsi="Segoe UI" w:cs="Segoe UI"/>
           <w:lang w:val="en"/>
         </w:rPr>
-        <w:t>Web Developer  |  Full-Stack  |  Learning AI Integration</w:t>
+        <w:t>Web Developer  |  Full-Stack  |  AI Integration</w:t>
       </w:r>
     </w:p>
     <w:p>
@@ -57,14 +57,14 @@
           <w:lang w:val="en"/>
         </w:rPr>
         <w:br/>
-        <w:t xml:space="preserve">github.com/vegastristan1  ·  </w:t>
-      </w:r>
-      <w:r>
-        <w:rPr>
-          <w:rFonts w:ascii="Segoe UI" w:hAnsi="Segoe UI" w:cs="Segoe UI"/>
-          <w:lang w:val="en"/>
-        </w:rPr>
-        <w:t xml:space="preserve">linkedin.com/in/tristan-vegas  ·  tristan-portfolio-v1.vercel.app </w:t>
+        <w:t xml:space="preserve">github.com/vegastristan1  ·  linkedin.com/in/tristan-vegas  ·  </w:t>
+      </w:r>
+      <w:r>
+        <w:rPr>
+          <w:rFonts w:ascii="Segoe UI" w:hAnsi="Segoe UI" w:cs="Segoe UI"/>
+          <w:lang w:val="en"/>
+        </w:rPr>
+        <w:t xml:space="preserve">tristan-portfolio-v1.vercel.app </w:t>
       </w:r>
     </w:p>
     <w:p>
@@ -86,7 +86,7 @@
           <w:szCs w:val="21"/>
           <w:lang w:val="en"/>
         </w:rPr>
-        <w:pict w14:anchorId="378F79EF">
+        <w:pict w14:anchorId="005999F7">
           <v:rect id="_x0000_i1025" style="width:0;height:1.5pt" o:hralign="center" o:hrstd="t" o:hr="t" fillcolor="#a0a0a0" stroked="f"/>
         </w:pict>
       </w:r>
@@ -126,7 +126,17 @@
           <w:szCs w:val="21"/>
           <w:lang w:val="en"/>
         </w:rPr>
-        <w:t>Detail-oriented and self-motivated Web Developer with a Bachelor’s degree in Information Technology. Experienced in technical support, infrastructure management, and full-stack development. Proficient in Laravel, Vue.js, JavaScript, Node.js and cloud hosting services. A quality-driven professional with a strong work ethic and a passion for building efficient, user-friendly applications. Currently expanding into AI — learning Python and LLM API integration to build AI-powered web applications.</w:t>
+        <w:t>Detail-oriented and self-motivated Web Developer with a Bachelor’s degree in Information Technology. Experienced in technical support, infrastructure management, and full-stack development. Proficient in Next.js, TypeScript, React, Laravel, Vue.js, JavaScript and Node.js. A quality-driven professional with a strong work ethic and a passion for building efficient, user-friendly applications. Recently built and deployed an AI-powered full-stack application (Next.js + OpenAI), expanding into LLM API integratio</w:t>
+      </w:r>
+      <w:r>
+        <w:rPr>
+          <w:rFonts w:ascii="Segoe UI" w:hAnsi="Segoe UI" w:cs="Segoe UI"/>
+          <w:color w:val="18181B"/>
+          <w:sz w:val="21"/>
+          <w:szCs w:val="21"/>
+          <w:lang w:val="en"/>
+        </w:rPr>
+        <w:t>n and AI workflow design.</w:t>
       </w:r>
     </w:p>
     <w:p>
@@ -706,7 +716,7 @@
     </w:p>
     <w:p>
       <w:pPr>
-        <w:divId w:val="195317102"/>
+        <w:divId w:val="2041395335"/>
         <w:rPr>
           <w:rFonts w:ascii="Segoe UI" w:eastAsia="Times New Roman" w:hAnsi="Segoe UI" w:cs="Segoe UI"/>
           <w:color w:val="18181B"/>
@@ -735,12 +745,12 @@
           <w:szCs w:val="21"/>
           <w:lang w:val="en"/>
         </w:rPr>
-        <w:t xml:space="preserve"> HTML5, CSS, JavaScript (ES6+), TypeScript, React.js, Vue.js, Angular</w:t>
-      </w:r>
-    </w:p>
-    <w:p>
-      <w:pPr>
-        <w:divId w:val="487747928"/>
+        <w:t xml:space="preserve"> HTML5, CSS, JavaScript (ES6+), TypeScript, React.js, Vue.js, Angular, Next.js, Tailwind CSS</w:t>
+      </w:r>
+    </w:p>
+    <w:p>
+      <w:pPr>
+        <w:divId w:val="544101655"/>
         <w:rPr>
           <w:rFonts w:ascii="Segoe UI" w:eastAsia="Times New Roman" w:hAnsi="Segoe UI" w:cs="Segoe UI"/>
           <w:color w:val="18181B"/>
@@ -774,7 +784,7 @@
     </w:p>
     <w:p>
       <w:pPr>
-        <w:divId w:val="1497184581"/>
+        <w:divId w:val="1717895875"/>
         <w:rPr>
           <w:rFonts w:ascii="Segoe UI" w:eastAsia="Times New Roman" w:hAnsi="Segoe UI" w:cs="Segoe UI"/>
           <w:color w:val="18181B"/>
@@ -808,7 +818,7 @@
     </w:p>
     <w:p>
       <w:pPr>
-        <w:divId w:val="534005371"/>
+        <w:divId w:val="171187071"/>
         <w:rPr>
           <w:rFonts w:ascii="Segoe UI" w:eastAsia="Times New Roman" w:hAnsi="Segoe UI" w:cs="Segoe UI"/>
           <w:color w:val="18181B"/>
@@ -837,12 +847,12 @@
           <w:szCs w:val="21"/>
           <w:lang w:val="en"/>
         </w:rPr>
-        <w:t xml:space="preserve"> PostgreSQL, MySQL, SQL, SQL Server</w:t>
-      </w:r>
-    </w:p>
-    <w:p>
-      <w:pPr>
-        <w:divId w:val="1913389357"/>
+        <w:t xml:space="preserve"> PostgreSQL, MySQL, SQL, SQL Server, Prisma</w:t>
+      </w:r>
+    </w:p>
+    <w:p>
+      <w:pPr>
+        <w:divId w:val="1640723221"/>
         <w:rPr>
           <w:rFonts w:ascii="Segoe UI" w:eastAsia="Times New Roman" w:hAnsi="Segoe UI" w:cs="Segoe UI"/>
           <w:color w:val="18181B"/>
@@ -871,12 +881,12 @@
           <w:szCs w:val="21"/>
           <w:lang w:val="en"/>
         </w:rPr>
-        <w:t xml:space="preserve"> Docker, AWS</w:t>
-      </w:r>
-    </w:p>
-    <w:p>
-      <w:pPr>
-        <w:divId w:val="518786244"/>
+        <w:t xml:space="preserve"> Docker, AWS, Vercel</w:t>
+      </w:r>
+    </w:p>
+    <w:p>
+      <w:pPr>
+        <w:divId w:val="131096535"/>
         <w:rPr>
           <w:rFonts w:ascii="Segoe UI" w:eastAsia="Times New Roman" w:hAnsi="Segoe UI" w:cs="Segoe UI"/>
           <w:color w:val="18181B"/>
@@ -905,12 +915,12 @@
           <w:szCs w:val="21"/>
           <w:lang w:val="en"/>
         </w:rPr>
-        <w:t xml:space="preserve"> MVC, API Development, Authentication &amp; Authorization, Manual QA Testing</w:t>
-      </w:r>
-    </w:p>
-    <w:p>
-      <w:pPr>
-        <w:divId w:val="981159729"/>
+        <w:t xml:space="preserve"> MVC, API Development, Authentication &amp; Authorization, Zod (Validation)</w:t>
+      </w:r>
+    </w:p>
+    <w:p>
+      <w:pPr>
+        <w:divId w:val="1872716809"/>
         <w:rPr>
           <w:rFonts w:ascii="Segoe UI" w:eastAsia="Times New Roman" w:hAnsi="Segoe UI" w:cs="Segoe UI"/>
           <w:color w:val="18181B"/>
@@ -929,22 +939,22 @@
           <w:szCs w:val="21"/>
           <w:lang w:val="en"/>
         </w:rPr>
-        <w:t>Tools:</w:t>
-      </w:r>
-      <w:r>
-        <w:rPr>
-          <w:rFonts w:ascii="Segoe UI" w:eastAsia="Times New Roman" w:hAnsi="Segoe UI" w:cs="Segoe UI"/>
-          <w:color w:val="18181B"/>
-          <w:sz w:val="21"/>
-          <w:szCs w:val="21"/>
-          <w:lang w:val="en"/>
-        </w:rPr>
-        <w:t xml:space="preserve"> Git, GitHub, npm, VS Code, Microsoft Excel</w:t>
-      </w:r>
-    </w:p>
-    <w:p>
-      <w:pPr>
-        <w:divId w:val="433595335"/>
+        <w:t>Testing &amp; Quality:</w:t>
+      </w:r>
+      <w:r>
+        <w:rPr>
+          <w:rFonts w:ascii="Segoe UI" w:eastAsia="Times New Roman" w:hAnsi="Segoe UI" w:cs="Segoe UI"/>
+          <w:color w:val="18181B"/>
+          <w:sz w:val="21"/>
+          <w:szCs w:val="21"/>
+          <w:lang w:val="en"/>
+        </w:rPr>
+        <w:t xml:space="preserve"> Vitest, Playwright, ESLint, Prettier, Manual QA Testing</w:t>
+      </w:r>
+    </w:p>
+    <w:p>
+      <w:pPr>
+        <w:divId w:val="1492991220"/>
         <w:rPr>
           <w:rFonts w:ascii="Segoe UI" w:eastAsia="Times New Roman" w:hAnsi="Segoe UI" w:cs="Segoe UI"/>
           <w:color w:val="18181B"/>
@@ -963,6 +973,40 @@
           <w:szCs w:val="21"/>
           <w:lang w:val="en"/>
         </w:rPr>
+        <w:t>Tools:</w:t>
+      </w:r>
+      <w:r>
+        <w:rPr>
+          <w:rFonts w:ascii="Segoe UI" w:eastAsia="Times New Roman" w:hAnsi="Segoe UI" w:cs="Segoe UI"/>
+          <w:color w:val="18181B"/>
+          <w:sz w:val="21"/>
+          <w:szCs w:val="21"/>
+          <w:lang w:val="en"/>
+        </w:rPr>
+        <w:t xml:space="preserve"> Git, GitHub, npm, VS Code, Microsoft Excel</w:t>
+      </w:r>
+    </w:p>
+    <w:p>
+      <w:pPr>
+        <w:divId w:val="1790393351"/>
+        <w:rPr>
+          <w:rFonts w:ascii="Segoe UI" w:eastAsia="Times New Roman" w:hAnsi="Segoe UI" w:cs="Segoe UI"/>
+          <w:color w:val="18181B"/>
+          <w:sz w:val="21"/>
+          <w:szCs w:val="21"/>
+          <w:lang w:val="en"/>
+        </w:rPr>
+      </w:pPr>
+      <w:r>
+        <w:rPr>
+          <w:rFonts w:ascii="Segoe UI" w:eastAsia="Times New Roman" w:hAnsi="Segoe UI" w:cs="Segoe UI"/>
+          <w:b/>
+          <w:bCs/>
+          <w:color w:val="18181B"/>
+          <w:sz w:val="21"/>
+          <w:szCs w:val="21"/>
+          <w:lang w:val="en"/>
+        </w:rPr>
         <w:t>Soft Skills:</w:t>
       </w:r>
       <w:r>
@@ -989,7 +1033,7 @@
           <w:rFonts w:ascii="Segoe UI" w:eastAsia="Times New Roman" w:hAnsi="Segoe UI" w:cs="Segoe UI"/>
           <w:lang w:val="en"/>
         </w:rPr>
-        <w:t>AI — Currently Learning</w:t>
+        <w:t>AI Integration — Building &amp; Shipping</w:t>
       </w:r>
     </w:p>
     <w:p>
@@ -1011,7 +1055,7 @@
           <w:szCs w:val="21"/>
           <w:lang w:val="en"/>
         </w:rPr>
-        <w:t>Expanding toward AI-integrated full-stack development:</w:t>
+        <w:t>Building and deploying AI-integrated full-stack applications:</w:t>
       </w:r>
     </w:p>
     <w:p>
@@ -1030,6 +1074,60 @@
           <w:rFonts w:ascii="Segoe UI" w:eastAsia="Times New Roman" w:hAnsi="Segoe UI" w:cs="Segoe UI"/>
           <w:lang w:val="en"/>
         </w:rPr>
+        <w:t>LLM API Integration (OpenAI) — Shipped in a real app</w:t>
+      </w:r>
+      <w:r>
+        <w:rPr>
+          <w:rFonts w:ascii="Segoe UI" w:eastAsia="Times New Roman" w:hAnsi="Segoe UI" w:cs="Segoe UI"/>
+          <w:color w:val="18181B"/>
+          <w:sz w:val="21"/>
+          <w:szCs w:val="21"/>
+          <w:lang w:val="en"/>
+        </w:rPr>
+        <w:t xml:space="preserve"> </w:t>
+      </w:r>
+      <w:r>
+        <w:rPr>
+          <w:rStyle w:val="chip1"/>
+          <w:rFonts w:ascii="Segoe UI" w:eastAsia="Times New Roman" w:hAnsi="Segoe UI" w:cs="Segoe UI"/>
+          <w:lang w:val="en"/>
+        </w:rPr>
+        <w:t>AI Workflows (human-in-the-loop approval) — Built in production</w:t>
+      </w:r>
+      <w:r>
+        <w:rPr>
+          <w:rFonts w:ascii="Segoe UI" w:eastAsia="Times New Roman" w:hAnsi="Segoe UI" w:cs="Segoe UI"/>
+          <w:color w:val="18181B"/>
+          <w:sz w:val="21"/>
+          <w:szCs w:val="21"/>
+          <w:lang w:val="en"/>
+        </w:rPr>
+        <w:t xml:space="preserve"> </w:t>
+      </w:r>
+      <w:r>
+        <w:rPr>
+          <w:rStyle w:val="chip1"/>
+          <w:rFonts w:ascii="Segoe UI" w:eastAsia="Times New Roman" w:hAnsi="Segoe UI" w:cs="Segoe UI"/>
+          <w:lang w:val="en"/>
+        </w:rPr>
+        <w:t>Prompt Engineering — Practicing</w:t>
+      </w:r>
+      <w:r>
+        <w:rPr>
+          <w:rFonts w:ascii="Segoe UI" w:eastAsia="Times New Roman" w:hAnsi="Segoe UI" w:cs="Segoe UI"/>
+          <w:color w:val="18181B"/>
+          <w:sz w:val="21"/>
+          <w:szCs w:val="21"/>
+          <w:lang w:val="en"/>
+        </w:rPr>
+        <w:t xml:space="preserve"> </w:t>
+      </w:r>
+      <w:r>
+        <w:rPr>
+          <w:rStyle w:val="chip1"/>
+          <w:rFonts w:ascii="Segoe UI" w:eastAsia="Times New Roman" w:hAnsi="Segoe UI" w:cs="Segoe UI"/>
+          <w:lang w:val="en"/>
+        </w:rPr>
         <w:t>Python (fundamentals) — Learning</w:t>
       </w:r>
       <w:r>
@@ -1042,60 +1140,6 @@
         </w:rPr>
         <w:t xml:space="preserve"> </w:t>
       </w:r>
-      <w:r>
-        <w:rPr>
-          <w:rStyle w:val="chip1"/>
-          <w:rFonts w:ascii="Segoe UI" w:eastAsia="Times New Roman" w:hAnsi="Segoe UI" w:cs="Segoe UI"/>
-          <w:lang w:val="en"/>
-        </w:rPr>
-        <w:t>LLM API Integration (OpenAI / Claude) — Learning</w:t>
-      </w:r>
-      <w:r>
-        <w:rPr>
-          <w:rFonts w:ascii="Segoe UI" w:eastAsia="Times New Roman" w:hAnsi="Segoe UI" w:cs="Segoe UI"/>
-          <w:color w:val="18181B"/>
-          <w:sz w:val="21"/>
-          <w:szCs w:val="21"/>
-          <w:lang w:val="en"/>
-        </w:rPr>
-        <w:t xml:space="preserve"> </w:t>
-      </w:r>
-      <w:r>
-        <w:rPr>
-          <w:rStyle w:val="chip1"/>
-          <w:rFonts w:ascii="Segoe UI" w:eastAsia="Times New Roman" w:hAnsi="Segoe UI" w:cs="Segoe UI"/>
-          <w:lang w:val="en"/>
-        </w:rPr>
-        <w:t>Prompt Engineering — Practicing</w:t>
-      </w:r>
-      <w:r>
-        <w:rPr>
-          <w:rFonts w:ascii="Segoe UI" w:eastAsia="Times New Roman" w:hAnsi="Segoe UI" w:cs="Segoe UI"/>
-          <w:color w:val="18181B"/>
-          <w:sz w:val="21"/>
-          <w:szCs w:val="21"/>
-          <w:lang w:val="en"/>
-        </w:rPr>
-        <w:t xml:space="preserve"> </w:t>
-      </w:r>
-      <w:r>
-        <w:rPr>
-          <w:rStyle w:val="chip1"/>
-          <w:rFonts w:ascii="Segoe UI" w:eastAsia="Times New Roman" w:hAnsi="Segoe UI" w:cs="Segoe UI"/>
-          <w:lang w:val="en"/>
-        </w:rPr>
-        <w:t>AI-Assisted Development (Copilot / Claude) — Daily workflow</w:t>
-      </w:r>
-      <w:r>
-        <w:rPr>
-          <w:rFonts w:ascii="Segoe UI" w:eastAsia="Times New Roman" w:hAnsi="Segoe UI" w:cs="Segoe UI"/>
-          <w:color w:val="18181B"/>
-          <w:sz w:val="21"/>
-          <w:szCs w:val="21"/>
-          <w:lang w:val="en"/>
-        </w:rPr>
-        <w:t xml:space="preserve"> </w:t>
-      </w:r>
     </w:p>
     <w:p>
       <w:pPr>
@@ -1116,7 +1160,136 @@
     <w:p>
       <w:pPr>
         <w:pStyle w:val="Heading3"/>
-        <w:divId w:val="443114441"/>
+        <w:divId w:val="1680235023"/>
+        <w:rPr>
+          <w:rFonts w:ascii="Segoe UI" w:eastAsia="Times New Roman" w:hAnsi="Segoe UI" w:cs="Segoe UI"/>
+          <w:color w:val="18181B"/>
+          <w:lang w:val="en"/>
+        </w:rPr>
+      </w:pPr>
+      <w:r>
+        <w:rPr>
+          <w:rFonts w:ascii="Segoe UI" w:eastAsia="Times New Roman" w:hAnsi="Segoe UI" w:cs="Segoe UI"/>
+          <w:color w:val="18181B"/>
+          <w:lang w:val="en"/>
+        </w:rPr>
+        <w:t>AI Developer Task Manager</w:t>
+      </w:r>
+    </w:p>
+    <w:p>
+      <w:pPr>
+        <w:pStyle w:val="NormalWeb"/>
+        <w:divId w:val="1680235023"/>
+        <w:rPr>
+          <w:rFonts w:ascii="Segoe UI" w:hAnsi="Segoe UI" w:cs="Segoe UI"/>
+          <w:color w:val="18181B"/>
+          <w:sz w:val="21"/>
+          <w:szCs w:val="21"/>
+          <w:lang w:val="en"/>
+        </w:rPr>
+      </w:pPr>
+      <w:r>
+        <w:rPr>
+          <w:rFonts w:ascii="Segoe UI" w:hAnsi="Segoe UI" w:cs="Segoe UI"/>
+          <w:color w:val="18181B"/>
+          <w:sz w:val="21"/>
+          <w:szCs w:val="21"/>
+          <w:lang w:val="en"/>
+        </w:rPr>
+        <w:t>AI-powered task and project management platform for developers: Next.js + TypeScript on PostgreSQL (Neon) with Prisma, Auth.js and Zod validation; AI task breakdown, implementation plans, acceptance criteria and technical review behind an approve/reject workflow; Kanban, sprints, task dependencies and a developer dashboard. Live: ai-developer-task-manager.vercel.app</w:t>
+      </w:r>
+    </w:p>
+    <w:p>
+      <w:pPr>
+        <w:pStyle w:val="tools1"/>
+        <w:divId w:val="1680235023"/>
+        <w:rPr>
+          <w:rFonts w:ascii="Segoe UI" w:hAnsi="Segoe UI" w:cs="Segoe UI"/>
+          <w:lang w:val="en"/>
+        </w:rPr>
+      </w:pPr>
+      <w:r>
+        <w:rPr>
+          <w:rFonts w:ascii="Segoe UI" w:hAnsi="Segoe UI" w:cs="Segoe UI"/>
+          <w:lang w:val="en"/>
+        </w:rPr>
+        <w:lastRenderedPageBreak/>
+        <w:t>Next.js  ·  TypeScript  ·  PostgreSQL  ·  Prisma  ·  OpenAI</w:t>
+      </w:r>
+    </w:p>
+    <w:p>
+      <w:pPr>
+        <w:pStyle w:val="Heading3"/>
+        <w:divId w:val="129129340"/>
+        <w:rPr>
+          <w:rFonts w:ascii="Segoe UI" w:eastAsia="Times New Roman" w:hAnsi="Segoe UI" w:cs="Segoe UI"/>
+          <w:color w:val="18181B"/>
+          <w:lang w:val="en"/>
+        </w:rPr>
+      </w:pPr>
+      <w:r>
+        <w:rPr>
+          <w:rFonts w:ascii="Segoe UI" w:eastAsia="Times New Roman" w:hAnsi="Segoe UI" w:cs="Segoe UI"/>
+          <w:color w:val="18181B"/>
+          <w:lang w:val="en"/>
+        </w:rPr>
+        <w:t>Dev Hub</w:t>
+      </w:r>
+    </w:p>
+    <w:p>
+      <w:pPr>
+        <w:pStyle w:val="NormalWeb"/>
+        <w:divId w:val="129129340"/>
+        <w:rPr>
+          <w:rFonts w:ascii="Segoe UI" w:hAnsi="Segoe UI" w:cs="Segoe UI"/>
+          <w:color w:val="18181B"/>
+          <w:sz w:val="21"/>
+          <w:szCs w:val="21"/>
+          <w:lang w:val="en"/>
+        </w:rPr>
+      </w:pPr>
+      <w:r>
+        <w:rPr>
+          <w:rFonts w:ascii="Segoe UI" w:hAnsi="Segoe UI" w:cs="Segoe UI"/>
+          <w:color w:val="18181B"/>
+          <w:sz w:val="21"/>
+          <w:szCs w:val="21"/>
+          <w:lang w:val="en"/>
+        </w:rPr>
+        <w:t xml:space="preserve">Local-first developer hub that shows, runs and guides every project in one place — </w:t>
+      </w:r>
+      <w:r>
+        <w:rPr>
+          <w:rFonts w:ascii="Segoe UI" w:hAnsi="Segoe UI" w:cs="Segoe UI"/>
+          <w:color w:val="18181B"/>
+          <w:sz w:val="21"/>
+          <w:szCs w:val="21"/>
+          <w:lang w:val="en"/>
+        </w:rPr>
+        <w:t>auto-detects apps from package.json, artisan or docker-compose.yml, generates stack, blueprint and setup-guide views, with run/stop controls via a local Express server.</w:t>
+      </w:r>
+    </w:p>
+    <w:p>
+      <w:pPr>
+        <w:pStyle w:val="tools1"/>
+        <w:divId w:val="129129340"/>
+        <w:rPr>
+          <w:rFonts w:ascii="Segoe UI" w:hAnsi="Segoe UI" w:cs="Segoe UI"/>
+          <w:lang w:val="en"/>
+        </w:rPr>
+      </w:pPr>
+      <w:r>
+        <w:rPr>
+          <w:rFonts w:ascii="Segoe UI" w:hAnsi="Segoe UI" w:cs="Segoe UI"/>
+          <w:lang w:val="en"/>
+        </w:rPr>
+        <w:t>Node.js  ·  Express  ·  React  ·  Full-Stack</w:t>
+      </w:r>
+    </w:p>
+    <w:p>
+      <w:pPr>
+        <w:pStyle w:val="Heading3"/>
+        <w:divId w:val="1182474206"/>
         <w:rPr>
           <w:rFonts w:ascii="Segoe UI" w:eastAsia="Times New Roman" w:hAnsi="Segoe UI" w:cs="Segoe UI"/>
           <w:color w:val="18181B"/>
@@ -1135,7 +1308,7 @@
     <w:p>
       <w:pPr>
         <w:pStyle w:val="NormalWeb"/>
-        <w:divId w:val="443114441"/>
+        <w:divId w:val="1182474206"/>
         <w:rPr>
           <w:rFonts w:ascii="Segoe UI" w:hAnsi="Segoe UI" w:cs="Segoe UI"/>
           <w:color w:val="18181B"/>
@@ -1158,7 +1331,7 @@
     <w:p>
       <w:pPr>
         <w:pStyle w:val="tools1"/>
-        <w:divId w:val="443114441"/>
+        <w:divId w:val="1182474206"/>
         <w:rPr>
           <w:rFonts w:ascii="Segoe UI" w:hAnsi="Segoe UI" w:cs="Segoe UI"/>
           <w:lang w:val="en"/>
@@ -1175,7 +1348,7 @@
     <w:p>
       <w:pPr>
         <w:pStyle w:val="Heading3"/>
-        <w:divId w:val="1304383272"/>
+        <w:divId w:val="212884202"/>
         <w:rPr>
           <w:rFonts w:ascii="Segoe UI" w:eastAsia="Times New Roman" w:hAnsi="Segoe UI" w:cs="Segoe UI"/>
           <w:color w:val="18181B"/>
@@ -1194,32 +1367,30 @@
     <w:p>
       <w:pPr>
         <w:pStyle w:val="NormalWeb"/>
-        <w:divId w:val="1304383272"/>
-        <w:rPr>
-          <w:rFonts w:ascii="Segoe UI" w:hAnsi="Segoe UI" w:cs="Segoe UI"/>
-          <w:color w:val="18181B"/>
-          <w:sz w:val="21"/>
-          <w:szCs w:val="21"/>
-          <w:lang w:val="en"/>
-        </w:rPr>
-      </w:pPr>
-      <w:r>
-        <w:rPr>
-          <w:rFonts w:ascii="Segoe UI" w:hAnsi="Segoe UI" w:cs="Segoe UI"/>
-          <w:color w:val="18181B"/>
-          <w:sz w:val="21"/>
-          <w:szCs w:val="21"/>
-          <w:lang w:val="en"/>
-        </w:rPr>
-        <w:lastRenderedPageBreak/>
+        <w:divId w:val="212884202"/>
+        <w:rPr>
+          <w:rFonts w:ascii="Segoe UI" w:hAnsi="Segoe UI" w:cs="Segoe UI"/>
+          <w:color w:val="18181B"/>
+          <w:sz w:val="21"/>
+          <w:szCs w:val="21"/>
+          <w:lang w:val="en"/>
+        </w:rPr>
+      </w:pPr>
+      <w:r>
+        <w:rPr>
+          <w:rFonts w:ascii="Segoe UI" w:hAnsi="Segoe UI" w:cs="Segoe UI"/>
+          <w:color w:val="18181B"/>
+          <w:sz w:val="21"/>
+          <w:szCs w:val="21"/>
+          <w:lang w:val="en"/>
+        </w:rPr>
         <w:t>Client-facing booking website, itinerary and tour management, mobile admin app with notifications, and booking/payment approval workflows.</w:t>
       </w:r>
     </w:p>
     <w:p>
       <w:pPr>
         <w:pStyle w:val="tools1"/>
-        <w:spacing w:after="160"/>
-        <w:divId w:val="1304383272"/>
+        <w:divId w:val="212884202"/>
         <w:rPr>
           <w:rFonts w:ascii="Segoe UI" w:hAnsi="Segoe UI" w:cs="Segoe UI"/>
           <w:lang w:val="en"/>
@@ -1236,7 +1407,7 @@
     <w:p>
       <w:pPr>
         <w:pStyle w:val="Heading3"/>
-        <w:divId w:val="1097604861"/>
+        <w:divId w:val="1526405689"/>
         <w:rPr>
           <w:rFonts w:ascii="Segoe UI" w:eastAsia="Times New Roman" w:hAnsi="Segoe UI" w:cs="Segoe UI"/>
           <w:color w:val="18181B"/>
@@ -1255,7 +1426,7 @@
     <w:p>
       <w:pPr>
         <w:pStyle w:val="NormalWeb"/>
-        <w:divId w:val="1097604861"/>
+        <w:divId w:val="1526405689"/>
         <w:rPr>
           <w:rFonts w:ascii="Segoe UI" w:hAnsi="Segoe UI" w:cs="Segoe UI"/>
           <w:color w:val="18181B"/>
@@ -1278,8 +1449,7 @@
     <w:p>
       <w:pPr>
         <w:pStyle w:val="tools1"/>
-        <w:spacing w:after="160"/>
-        <w:divId w:val="1097604861"/>
+        <w:divId w:val="1526405689"/>
         <w:rPr>
           <w:rFonts w:ascii="Segoe UI" w:hAnsi="Segoe UI" w:cs="Segoe UI"/>
           <w:lang w:val="en"/>
@@ -1296,7 +1466,7 @@
     <w:p>
       <w:pPr>
         <w:pStyle w:val="Heading3"/>
-        <w:divId w:val="1730372877"/>
+        <w:divId w:val="262231281"/>
         <w:rPr>
           <w:rFonts w:ascii="Segoe UI" w:eastAsia="Times New Roman" w:hAnsi="Segoe UI" w:cs="Segoe UI"/>
           <w:color w:val="18181B"/>
@@ -1315,7 +1485,7 @@
     <w:p>
       <w:pPr>
         <w:pStyle w:val="NormalWeb"/>
-        <w:divId w:val="1730372877"/>
+        <w:divId w:val="262231281"/>
         <w:rPr>
           <w:rFonts w:ascii="Segoe UI" w:hAnsi="Segoe UI" w:cs="Segoe UI"/>
           <w:color w:val="18181B"/>
@@ -1338,8 +1508,7 @@
     <w:p>
       <w:pPr>
         <w:pStyle w:val="tools1"/>
-        <w:spacing w:after="160"/>
-        <w:divId w:val="1730372877"/>
+        <w:divId w:val="262231281"/>
         <w:rPr>
           <w:rFonts w:ascii="Segoe UI" w:hAnsi="Segoe UI" w:cs="Segoe UI"/>
           <w:lang w:val="en"/>
@@ -1356,7 +1525,7 @@
     <w:p>
       <w:pPr>
         <w:pStyle w:val="Heading3"/>
-        <w:divId w:val="1236358932"/>
+        <w:divId w:val="811673737"/>
         <w:rPr>
           <w:rFonts w:ascii="Segoe UI" w:eastAsia="Times New Roman" w:hAnsi="Segoe UI" w:cs="Segoe UI"/>
           <w:color w:val="18181B"/>
@@ -1375,7 +1544,7 @@
     <w:p>
       <w:pPr>
         <w:pStyle w:val="NormalWeb"/>
-        <w:divId w:val="1236358932"/>
+        <w:divId w:val="811673737"/>
         <w:rPr>
           <w:rFonts w:ascii="Segoe UI" w:hAnsi="Segoe UI" w:cs="Segoe UI"/>
           <w:color w:val="18181B"/>
@@ -1398,8 +1567,7 @@
     <w:p>
       <w:pPr>
         <w:pStyle w:val="tools1"/>
-        <w:spacing w:after="160"/>
-        <w:divId w:val="1236358932"/>
+        <w:divId w:val="811673737"/>
         <w:rPr>
           <w:rFonts w:ascii="Segoe UI" w:hAnsi="Segoe UI" w:cs="Segoe UI"/>
           <w:lang w:val="en"/>
@@ -1416,7 +1584,7 @@
     <w:p>
       <w:pPr>
         <w:pStyle w:val="Heading3"/>
-        <w:divId w:val="1144587514"/>
+        <w:divId w:val="777142546"/>
         <w:rPr>
           <w:rFonts w:ascii="Segoe UI" w:eastAsia="Times New Roman" w:hAnsi="Segoe UI" w:cs="Segoe UI"/>
           <w:color w:val="18181B"/>
@@ -1435,7 +1603,7 @@
     <w:p>
       <w:pPr>
         <w:pStyle w:val="NormalWeb"/>
-        <w:divId w:val="1144587514"/>
+        <w:divId w:val="777142546"/>
         <w:rPr>
           <w:rFonts w:ascii="Segoe UI" w:hAnsi="Segoe UI" w:cs="Segoe UI"/>
           <w:color w:val="18181B"/>
@@ -1458,8 +1626,7 @@
     <w:p>
       <w:pPr>
         <w:pStyle w:val="tools1"/>
-        <w:spacing w:after="160"/>
-        <w:divId w:val="1144587514"/>
+        <w:divId w:val="777142546"/>
         <w:rPr>
           <w:rFonts w:ascii="Segoe UI" w:hAnsi="Segoe UI" w:cs="Segoe UI"/>
           <w:lang w:val="en"/>
@@ -1476,7 +1643,7 @@
     <w:p>
       <w:pPr>
         <w:pStyle w:val="Heading3"/>
-        <w:divId w:val="1695887862"/>
+        <w:divId w:val="1724525447"/>
         <w:rPr>
           <w:rFonts w:ascii="Segoe UI" w:eastAsia="Times New Roman" w:hAnsi="Segoe UI" w:cs="Segoe UI"/>
           <w:color w:val="18181B"/>
@@ -1495,7 +1662,7 @@
     <w:p>
       <w:pPr>
         <w:pStyle w:val="NormalWeb"/>
-        <w:divId w:val="1695887862"/>
+        <w:divId w:val="1724525447"/>
         <w:rPr>
           <w:rFonts w:ascii="Segoe UI" w:hAnsi="Segoe UI" w:cs="Segoe UI"/>
           <w:color w:val="18181B"/>
@@ -1518,8 +1685,7 @@
     <w:p>
       <w:pPr>
         <w:pStyle w:val="tools1"/>
-        <w:spacing w:after="160"/>
-        <w:divId w:val="1695887862"/>
+        <w:divId w:val="1724525447"/>
         <w:rPr>
           <w:rFonts w:ascii="Segoe UI" w:hAnsi="Segoe UI" w:cs="Segoe UI"/>
           <w:lang w:val="en"/>
@@ -1634,9 +1800,9 @@
 <file path=word/numbering.xml><?xml version="1.0" encoding="utf-8"?>
 <w:numbering xmlns:wpc="http://schemas.microsoft.com/office/word/2010/wordprocessingCanvas" xmlns:cx="http://schemas.microsoft.com/office/drawing/2014/chartex" xmlns:cx1="http://schemas.microsoft.com/office/drawing/2015/9/8/chartex" xmlns:cx2="http://schemas.microsoft.com/office/drawing/2015/10/21/chartex" xmlns:cx3="http://schemas.microsoft.com/office/drawing/2016/5/9/chartex" xmlns:cx4="http://schemas.microsoft.com/office/drawing/2016/5/10/chartex" xmlns:cx5="http://schemas.microsoft.com/office/drawing/2016/5/11/chartex" xmlns:cx6="http://schemas.microsoft.com/office/drawing/2016/5/12/chartex" xmlns:cx7="http://schemas.microsoft.com/office/drawing/2016/5/13/chartex" xmlns:cx8="http://schemas.microsoft.com/office/drawing/2016/5/14/chartex" xmlns:mc="http://schemas.openxmlformats.org/markup-compatibility/2006" xmlns:aink="http://schemas.microsoft.com/office/drawing/2016/ink" xmlns:am3d="http://schemas.microsoft.com/office/drawing/2017/model3d" xmlns:o="urn:schemas-microsoft-com:office:office" xmlns:oel="http://schemas.microsoft.com/office/2019/extlst" xmlns:r="http://schemas.openxmlformats.org/officeDocument/2006/relationships" xmlns:m="http://schemas.openxmlformats.org/officeDocument/2006/math" xmlns:v="urn:schemas-microsoft-com:vml" xmlns:wp14="http://schemas.microsoft.com/office/word/2010/wordprocessingDrawing" xmlns:wp="http://schemas.openxmlformats.org/drawingml/2006/wordprocessingDrawing" xmlns:w10="urn:schemas-microsoft-com:office:word" xmlns:w="http://schemas.openxmlformats.org/wordprocessingml/2006/main" xmlns:w14="http://schemas.microsoft.com/office/word/2010/wordml" xmlns:w15="http://schemas.microsoft.com/office/word/2012/wordml" xmlns:w16cex="http://schemas.microsoft.com/office/word/2018/wordml/cex" xmlns:w16cid="http://schemas.microsoft.com/office/word/2016/wordml/cid" xmlns:w16="http://schemas.microsoft.com/office/word/2018/wordml" xmlns:w16du="http://schemas.microsoft.com/office/word/2023/wordml/word16du" xmlns:w16sdtdh="http://schemas.microsoft.com/office/word/2020/wordml/sdtdatahash" xmlns:w16sdtfl="http://schemas.microsoft.com/office/word/2024/wordml/sdtformatlock" xmlns:w16se="http://schemas.microsoft.com/office/word/2015/wordml/symex" xmlns:wpg="http://schemas.microsoft.com/office/word/2010/wordprocessingGroup" xmlns:wpi="http://schemas.microsoft.com/office/word/2010/wordprocessingInk" xmlns:wne="http://schemas.microsoft.com/office/word/2006/wordml" xmlns:wps="http://schemas.microsoft.com/office/word/2010/wordprocessingShape" mc:Ignorable="w14 w15 w16se w16cid w16 w16cex w16sdtdh w16sdtfl w16du wp14">
   <w:abstractNum w:abstractNumId="0" w15:restartNumberingAfterBreak="0">
-    <w:nsid w:val="035746F6"/>
+    <w:nsid w:val="02466398"/>
     <w:multiLevelType w:val="multilevel"/>
-    <w:tmpl w:val="042C6592"/>
+    <w:tmpl w:val="0FBE5658"/>
     <w:lvl w:ilvl="0">
       <w:start w:val="1"/>
       <w:numFmt w:val="bullet"/>
@@ -1783,9 +1949,9 @@
     </w:lvl>
   </w:abstractNum>
   <w:abstractNum w:abstractNumId="1" w15:restartNumberingAfterBreak="0">
-    <w:nsid w:val="27A9345E"/>
+    <w:nsid w:val="687A51B4"/>
     <w:multiLevelType w:val="multilevel"/>
-    <w:tmpl w:val="6108E53A"/>
+    <w:tmpl w:val="3DDC8E30"/>
     <w:lvl w:ilvl="0">
       <w:start w:val="1"/>
       <w:numFmt w:val="bullet"/>
@@ -1932,9 +2098,9 @@
     </w:lvl>
   </w:abstractNum>
   <w:abstractNum w:abstractNumId="2" w15:restartNumberingAfterBreak="0">
-    <w:nsid w:val="36C67BCA"/>
+    <w:nsid w:val="6A05162D"/>
     <w:multiLevelType w:val="multilevel"/>
-    <w:tmpl w:val="B1BCF064"/>
+    <w:tmpl w:val="DA6CE834"/>
     <w:lvl w:ilvl="0">
       <w:start w:val="1"/>
       <w:numFmt w:val="bullet"/>
@@ -2081,9 +2247,9 @@
     </w:lvl>
   </w:abstractNum>
   <w:abstractNum w:abstractNumId="3" w15:restartNumberingAfterBreak="0">
-    <w:nsid w:val="392B6B59"/>
+    <w:nsid w:val="7A1A0750"/>
     <w:multiLevelType w:val="multilevel"/>
-    <w:tmpl w:val="E828FBCA"/>
+    <w:tmpl w:val="91CCAD3E"/>
     <w:lvl w:ilvl="0">
       <w:start w:val="1"/>
       <w:numFmt w:val="bullet"/>
@@ -2229,17 +2395,17 @@
       </w:rPr>
     </w:lvl>
   </w:abstractNum>
-  <w:num w:numId="1" w16cid:durableId="2058115584">
+  <w:num w:numId="1" w16cid:durableId="1877506292">
+    <w:abstractNumId w:val="0"/>
+  </w:num>
+  <w:num w:numId="2" w16cid:durableId="1230581028">
     <w:abstractNumId w:val="2"/>
   </w:num>
-  <w:num w:numId="2" w16cid:durableId="71855869">
-    <w:abstractNumId w:val="0"/>
+  <w:num w:numId="3" w16cid:durableId="1588155389">
+    <w:abstractNumId w:val="3"/>
   </w:num>
-  <w:num w:numId="3" w16cid:durableId="801505397">
+  <w:num w:numId="4" w16cid:durableId="354696465">
     <w:abstractNumId w:val="1"/>
-  </w:num>
-  <w:num w:numId="4" w16cid:durableId="156263827">
-    <w:abstractNumId w:val="3"/>
   </w:num>
 </w:numbering>
 </file>

</xml_diff>